<commit_message>
Controller Tag CREATE et DELETE
</commit_message>
<xml_diff>
--- a/S11_Revision_Instructions.docx
+++ b/S11_Revision_Instructions.docx
@@ -263,7 +263,25 @@
                 <w:rFonts w:ascii="Calibri" w:hAnsi="Calibri" w:cs="Calibri"/>
                 <w:color w:val="000000"/>
               </w:rPr>
-              <w:t>NET Core MVC </w:t>
+              <w:t>NET </w:t>
+            </w:r>
+            <w:proofErr w:type="spellStart"/>
+            <w:r>
+              <w:rPr>
+                <w:rStyle w:val="normaltextrun"/>
+                <w:rFonts w:ascii="Calibri" w:hAnsi="Calibri" w:cs="Calibri"/>
+                <w:color w:val="000000"/>
+              </w:rPr>
+              <w:t>Core</w:t>
+            </w:r>
+            <w:proofErr w:type="spellEnd"/>
+            <w:r>
+              <w:rPr>
+                <w:rStyle w:val="normaltextrun"/>
+                <w:rFonts w:ascii="Calibri" w:hAnsi="Calibri" w:cs="Calibri"/>
+                <w:color w:val="000000"/>
+              </w:rPr>
+              <w:t> MVC </w:t>
             </w:r>
             <w:r>
               <w:rPr>
@@ -439,7 +457,25 @@
                 <w:rFonts w:ascii="Calibri" w:hAnsi="Calibri" w:cs="Calibri"/>
                 <w:color w:val="000000"/>
               </w:rPr>
-              <w:t>Mise en place d’Entity Framework</w:t>
+              <w:t>Mise en place d’</w:t>
+            </w:r>
+            <w:proofErr w:type="spellStart"/>
+            <w:r>
+              <w:rPr>
+                <w:rStyle w:val="normaltextrun"/>
+                <w:rFonts w:ascii="Calibri" w:hAnsi="Calibri" w:cs="Calibri"/>
+                <w:color w:val="000000"/>
+              </w:rPr>
+              <w:t>Entity</w:t>
+            </w:r>
+            <w:proofErr w:type="spellEnd"/>
+            <w:r>
+              <w:rPr>
+                <w:rStyle w:val="normaltextrun"/>
+                <w:rFonts w:ascii="Calibri" w:hAnsi="Calibri" w:cs="Calibri"/>
+                <w:color w:val="000000"/>
+              </w:rPr>
+              <w:t> Framework</w:t>
             </w:r>
             <w:r>
               <w:rPr>
@@ -512,6 +548,7 @@
                 <w:rFonts w:ascii="Calibri" w:hAnsi="Calibri" w:cs="Calibri"/>
               </w:rPr>
             </w:pPr>
+            <w:proofErr w:type="spellStart"/>
             <w:r>
               <w:rPr>
                 <w:rStyle w:val="normaltextrun"/>
@@ -520,6 +557,7 @@
               </w:rPr>
               <w:t>Linq</w:t>
             </w:r>
+            <w:proofErr w:type="spellEnd"/>
             <w:r>
               <w:rPr>
                 <w:rStyle w:val="eop"/>
@@ -1923,6 +1961,7 @@
                 <w:bCs/>
                 <w:noProof/>
                 <w:color w:val="A1622F" w:themeColor="accent2" w:themeShade="80"/>
+                <w:highlight w:val="magenta"/>
                 <w:lang w:val="fr-CA"/>
               </w:rPr>
             </w:pPr>
@@ -1932,6 +1971,7 @@
                 <w:bCs/>
                 <w:noProof/>
                 <w:color w:val="A1622F" w:themeColor="accent2" w:themeShade="80"/>
+                <w:highlight w:val="magenta"/>
                 <w:lang w:val="fr-CA"/>
               </w:rPr>
               <w:t>Controller</w:t>
@@ -1942,6 +1982,7 @@
                 <w:bCs/>
                 <w:noProof/>
                 <w:color w:val="A1622F" w:themeColor="accent2" w:themeShade="80"/>
+                <w:highlight w:val="magenta"/>
                 <w:lang w:val="fr-CA"/>
               </w:rPr>
               <w:t xml:space="preserve"> Tag </w:t>
@@ -1952,6 +1993,7 @@
                 <w:bCs/>
                 <w:noProof/>
                 <w:color w:val="A1622F" w:themeColor="accent2" w:themeShade="80"/>
+                <w:highlight w:val="magenta"/>
                 <w:lang w:val="fr-CA"/>
               </w:rPr>
               <w:t>CREATE et DELETE</w:t>
@@ -1963,6 +2005,7 @@
               <w:rPr>
                 <w:noProof/>
                 <w:color w:val="auto"/>
+                <w:highlight w:val="magenta"/>
                 <w:lang w:val="fr-FR"/>
               </w:rPr>
             </w:pPr>
@@ -1970,6 +2013,7 @@
               <w:rPr>
                 <w:noProof/>
                 <w:color w:val="auto"/>
+                <w:highlight w:val="magenta"/>
                 <w:lang w:val="fr-FR"/>
               </w:rPr>
               <w:t>Vous devez compléter le code : décommentez par action pour vous permettre de tester adéquatement</w:t>
@@ -1986,6 +2030,7 @@
               <w:rPr>
                 <w:noProof/>
                 <w:color w:val="auto"/>
+                <w:highlight w:val="magenta"/>
                 <w:lang w:val="fr-FR"/>
               </w:rPr>
             </w:pPr>
@@ -1993,6 +2038,7 @@
               <w:rPr>
                 <w:noProof/>
                 <w:color w:val="auto"/>
+                <w:highlight w:val="magenta"/>
                 <w:lang w:val="fr-FR"/>
               </w:rPr>
               <w:t>Pour le Tag, implantez Create et Delete. (Get et Post)</w:t>
@@ -2009,6 +2055,7 @@
               <w:rPr>
                 <w:noProof/>
                 <w:color w:val="auto"/>
+                <w:highlight w:val="magenta"/>
                 <w:lang w:val="fr-FR"/>
               </w:rPr>
             </w:pPr>
@@ -2016,6 +2063,7 @@
               <w:rPr>
                 <w:noProof/>
                 <w:color w:val="auto"/>
+                <w:highlight w:val="magenta"/>
                 <w:lang w:val="fr-FR"/>
               </w:rPr>
               <w:t>Testez</w:t>
@@ -6249,6 +6297,7 @@
   <w:style w:type="character" w:default="1" w:styleId="Policepardfaut">
     <w:name w:val="Default Paragraph Font"/>
     <w:uiPriority w:val="1"/>
+    <w:semiHidden/>
     <w:unhideWhenUsed/>
   </w:style>
   <w:style w:type="table" w:default="1" w:styleId="TableauNormal">
@@ -7183,16 +7232,6 @@
 </file>
 
 <file path=customXml/item1.xml><?xml version="1.0" encoding="utf-8"?>
-<p:properties xmlns:p="http://schemas.microsoft.com/office/2006/metadata/properties" xmlns:xsi="http://www.w3.org/2001/XMLSchema-instance" xmlns:pc="http://schemas.microsoft.com/office/infopath/2007/PartnerControls">
-  <documentManagement/>
-</p:properties>
-</file>
-
-<file path=customXml/item2.xml><?xml version="1.0" encoding="utf-8"?>
-<b:Sources xmlns:b="http://schemas.openxmlformats.org/officeDocument/2006/bibliography" xmlns="http://schemas.openxmlformats.org/officeDocument/2006/bibliography" SelectedStyle="\APASixthEditionOfficeOnline.xsl" StyleName="APA" Version="6"/>
-</file>
-
-<file path=customXml/item3.xml><?xml version="1.0" encoding="utf-8"?>
 <ct:contentTypeSchema xmlns:ct="http://schemas.microsoft.com/office/2006/metadata/contentType" xmlns:ma="http://schemas.microsoft.com/office/2006/metadata/properties/metaAttributes" ct:_="" ma:_="" ma:contentTypeName="Document" ma:contentTypeID="0x010100354AEAE9FD62D747A26A546E5B1B5735" ma:contentTypeVersion="9" ma:contentTypeDescription="Crée un document." ma:contentTypeScope="" ma:versionID="45670149f0b2e242f3a8d428188cc564">
   <xsd:schema xmlns:xsd="http://www.w3.org/2001/XMLSchema" xmlns:xs="http://www.w3.org/2001/XMLSchema" xmlns:p="http://schemas.microsoft.com/office/2006/metadata/properties" xmlns:ns2="071933db-0376-4694-9786-b56cb37c4ec2" targetNamespace="http://schemas.microsoft.com/office/2006/metadata/properties" ma:root="true" ma:fieldsID="91ddbe44ea87bb26d8aecffc557f0fba" ns2:_="">
     <xsd:import namespace="071933db-0376-4694-9786-b56cb37c4ec2"/>
@@ -7370,6 +7409,16 @@
 </ct:contentTypeSchema>
 </file>
 
+<file path=customXml/item2.xml><?xml version="1.0" encoding="utf-8"?>
+<b:Sources xmlns:b="http://schemas.openxmlformats.org/officeDocument/2006/bibliography" xmlns="http://schemas.openxmlformats.org/officeDocument/2006/bibliography" SelectedStyle="\APASixthEditionOfficeOnline.xsl" StyleName="APA" Version="6"/>
+</file>
+
+<file path=customXml/item3.xml><?xml version="1.0" encoding="utf-8"?>
+<p:properties xmlns:p="http://schemas.microsoft.com/office/2006/metadata/properties" xmlns:xsi="http://www.w3.org/2001/XMLSchema-instance" xmlns:pc="http://schemas.microsoft.com/office/infopath/2007/PartnerControls">
+  <documentManagement/>
+</p:properties>
+</file>
+
 <file path=customXml/item4.xml><?xml version="1.0" encoding="utf-8"?>
 <?mso-contentType ?>
 <FormTemplates xmlns="http://schemas.microsoft.com/sharepoint/v3/contenttype/forms">
@@ -7380,23 +7429,6 @@
 </file>
 
 <file path=customXml/itemProps1.xml><?xml version="1.0" encoding="utf-8"?>
-<ds:datastoreItem xmlns:ds="http://schemas.openxmlformats.org/officeDocument/2006/customXml" ds:itemID="{FDBC88B7-C502-46FD-9B2D-62061649CD38}">
-  <ds:schemaRefs>
-    <ds:schemaRef ds:uri="http://schemas.microsoft.com/office/2006/metadata/properties"/>
-    <ds:schemaRef ds:uri="http://schemas.microsoft.com/office/infopath/2007/PartnerControls"/>
-  </ds:schemaRefs>
-</ds:datastoreItem>
-</file>
-
-<file path=customXml/itemProps2.xml><?xml version="1.0" encoding="utf-8"?>
-<ds:datastoreItem xmlns:ds="http://schemas.openxmlformats.org/officeDocument/2006/customXml" ds:itemID="{86D1C53D-3019-4C73-A2B3-82FC9063BE69}">
-  <ds:schemaRefs>
-    <ds:schemaRef ds:uri="http://schemas.openxmlformats.org/officeDocument/2006/bibliography"/>
-  </ds:schemaRefs>
-</ds:datastoreItem>
-</file>
-
-<file path=customXml/itemProps3.xml><?xml version="1.0" encoding="utf-8"?>
 <ds:datastoreItem xmlns:ds="http://schemas.openxmlformats.org/officeDocument/2006/customXml" ds:itemID="{F73817CE-6C24-4602-B65A-3DE68263A19D}">
   <ds:schemaRefs>
     <ds:schemaRef ds:uri="http://schemas.microsoft.com/office/2006/metadata/contentType"/>
@@ -7414,6 +7446,23 @@
 </ds:datastoreItem>
 </file>
 
+<file path=customXml/itemProps2.xml><?xml version="1.0" encoding="utf-8"?>
+<ds:datastoreItem xmlns:ds="http://schemas.openxmlformats.org/officeDocument/2006/customXml" ds:itemID="{86D1C53D-3019-4C73-A2B3-82FC9063BE69}">
+  <ds:schemaRefs>
+    <ds:schemaRef ds:uri="http://schemas.openxmlformats.org/officeDocument/2006/bibliography"/>
+  </ds:schemaRefs>
+</ds:datastoreItem>
+</file>
+
+<file path=customXml/itemProps3.xml><?xml version="1.0" encoding="utf-8"?>
+<ds:datastoreItem xmlns:ds="http://schemas.openxmlformats.org/officeDocument/2006/customXml" ds:itemID="{FDBC88B7-C502-46FD-9B2D-62061649CD38}">
+  <ds:schemaRefs>
+    <ds:schemaRef ds:uri="http://schemas.microsoft.com/office/2006/metadata/properties"/>
+    <ds:schemaRef ds:uri="http://schemas.microsoft.com/office/infopath/2007/PartnerControls"/>
+  </ds:schemaRefs>
+</ds:datastoreItem>
+</file>
+
 <file path=customXml/itemProps4.xml><?xml version="1.0" encoding="utf-8"?>
 <ds:datastoreItem xmlns:ds="http://schemas.openxmlformats.org/officeDocument/2006/customXml" ds:itemID="{859D30C0-E214-427F-990B-D6598D8CC357}">
   <ds:schemaRefs>

</xml_diff>

<commit_message>
Vue partielle : les Tags d’un article (story)
</commit_message>
<xml_diff>
--- a/S11_Revision_Instructions.docx
+++ b/S11_Revision_Instructions.docx
@@ -1961,7 +1961,6 @@
                 <w:bCs/>
                 <w:noProof/>
                 <w:color w:val="A1622F" w:themeColor="accent2" w:themeShade="80"/>
-                <w:highlight w:val="magenta"/>
                 <w:lang w:val="fr-CA"/>
               </w:rPr>
             </w:pPr>
@@ -1971,7 +1970,6 @@
                 <w:bCs/>
                 <w:noProof/>
                 <w:color w:val="A1622F" w:themeColor="accent2" w:themeShade="80"/>
-                <w:highlight w:val="magenta"/>
                 <w:lang w:val="fr-CA"/>
               </w:rPr>
               <w:t>Controller</w:t>
@@ -1982,7 +1980,6 @@
                 <w:bCs/>
                 <w:noProof/>
                 <w:color w:val="A1622F" w:themeColor="accent2" w:themeShade="80"/>
-                <w:highlight w:val="magenta"/>
                 <w:lang w:val="fr-CA"/>
               </w:rPr>
               <w:t xml:space="preserve"> Tag </w:t>
@@ -1993,7 +1990,6 @@
                 <w:bCs/>
                 <w:noProof/>
                 <w:color w:val="A1622F" w:themeColor="accent2" w:themeShade="80"/>
-                <w:highlight w:val="magenta"/>
                 <w:lang w:val="fr-CA"/>
               </w:rPr>
               <w:t>CREATE et DELETE</w:t>
@@ -2005,7 +2001,6 @@
               <w:rPr>
                 <w:noProof/>
                 <w:color w:val="auto"/>
-                <w:highlight w:val="magenta"/>
                 <w:lang w:val="fr-FR"/>
               </w:rPr>
             </w:pPr>
@@ -2013,7 +2008,6 @@
               <w:rPr>
                 <w:noProof/>
                 <w:color w:val="auto"/>
-                <w:highlight w:val="magenta"/>
                 <w:lang w:val="fr-FR"/>
               </w:rPr>
               <w:t>Vous devez compléter le code : décommentez par action pour vous permettre de tester adéquatement</w:t>
@@ -2030,7 +2024,6 @@
               <w:rPr>
                 <w:noProof/>
                 <w:color w:val="auto"/>
-                <w:highlight w:val="magenta"/>
                 <w:lang w:val="fr-FR"/>
               </w:rPr>
             </w:pPr>
@@ -2038,7 +2031,6 @@
               <w:rPr>
                 <w:noProof/>
                 <w:color w:val="auto"/>
-                <w:highlight w:val="magenta"/>
                 <w:lang w:val="fr-FR"/>
               </w:rPr>
               <w:t>Pour le Tag, implantez Create et Delete. (Get et Post)</w:t>
@@ -2055,7 +2047,6 @@
               <w:rPr>
                 <w:noProof/>
                 <w:color w:val="auto"/>
-                <w:highlight w:val="magenta"/>
                 <w:lang w:val="fr-FR"/>
               </w:rPr>
             </w:pPr>
@@ -2063,7 +2054,6 @@
               <w:rPr>
                 <w:noProof/>
                 <w:color w:val="auto"/>
-                <w:highlight w:val="magenta"/>
                 <w:lang w:val="fr-FR"/>
               </w:rPr>
               <w:t>Testez</w:t>
@@ -2204,6 +2194,7 @@
                 <w:bCs/>
                 <w:noProof/>
                 <w:color w:val="A1622F" w:themeColor="accent2" w:themeShade="80"/>
+                <w:highlight w:val="magenta"/>
                 <w:lang w:val="fr-CA"/>
               </w:rPr>
             </w:pPr>
@@ -2213,6 +2204,7 @@
                 <w:bCs/>
                 <w:noProof/>
                 <w:color w:val="A1622F" w:themeColor="accent2" w:themeShade="80"/>
+                <w:highlight w:val="magenta"/>
                 <w:lang w:val="fr-CA"/>
               </w:rPr>
               <w:t>Vue partielle : les Tags d’un article (story)</w:t>
@@ -2229,6 +2221,7 @@
               <w:rPr>
                 <w:noProof/>
                 <w:color w:val="auto"/>
+                <w:highlight w:val="magenta"/>
                 <w:lang w:val="fr-FR"/>
               </w:rPr>
             </w:pPr>
@@ -2236,6 +2229,7 @@
               <w:rPr>
                 <w:noProof/>
                 <w:color w:val="auto"/>
+                <w:highlight w:val="magenta"/>
                 <w:lang w:val="fr-FR"/>
               </w:rPr>
               <w:t xml:space="preserve">Complétez la vue partielles _tags pour que l’action delete du contrôleur StoryTags soit appelée. N’oubliez pas de passer l’id en paramètre ! </w:t>
@@ -2252,6 +2246,7 @@
               <w:rPr>
                 <w:noProof/>
                 <w:color w:val="auto"/>
+                <w:highlight w:val="magenta"/>
                 <w:lang w:val="fr-FR"/>
               </w:rPr>
             </w:pPr>
@@ -2259,6 +2254,7 @@
               <w:rPr>
                 <w:noProof/>
                 <w:color w:val="auto"/>
+                <w:highlight w:val="magenta"/>
                 <w:lang w:val="fr-FR"/>
               </w:rPr>
               <w:t xml:space="preserve">Dans Stories/Index, </w:t>
@@ -2267,6 +2263,7 @@
               <w:rPr>
                 <w:noProof/>
                 <w:color w:val="auto"/>
+                <w:highlight w:val="magenta"/>
                 <w:lang w:val="fr-FR"/>
               </w:rPr>
               <w:t xml:space="preserve">Insérez </w:t>
@@ -2275,6 +2272,7 @@
               <w:rPr>
                 <w:noProof/>
                 <w:color w:val="auto"/>
+                <w:highlight w:val="magenta"/>
                 <w:lang w:val="fr-FR"/>
               </w:rPr>
               <w:t>la</w:t>
@@ -2283,6 +2281,7 @@
               <w:rPr>
                 <w:noProof/>
                 <w:color w:val="auto"/>
+                <w:highlight w:val="magenta"/>
                 <w:lang w:val="fr-FR"/>
               </w:rPr>
               <w:t xml:space="preserve"> vue</w:t>
@@ -2291,6 +2290,7 @@
               <w:rPr>
                 <w:noProof/>
                 <w:color w:val="auto"/>
+                <w:highlight w:val="magenta"/>
                 <w:lang w:val="fr-FR"/>
               </w:rPr>
               <w:t xml:space="preserve"> _Tags</w:t>
@@ -2299,6 +2299,7 @@
               <w:rPr>
                 <w:noProof/>
                 <w:color w:val="auto"/>
+                <w:highlight w:val="magenta"/>
                 <w:lang w:val="fr-FR"/>
               </w:rPr>
               <w:t xml:space="preserve"> où il y a l’article</w:t>
@@ -2307,6 +2308,7 @@
               <w:rPr>
                 <w:noProof/>
                 <w:color w:val="auto"/>
+                <w:highlight w:val="magenta"/>
                 <w:lang w:val="fr-FR"/>
               </w:rPr>
               <w:t>,</w:t>
@@ -2315,6 +2317,7 @@
               <w:rPr>
                 <w:noProof/>
                 <w:color w:val="auto"/>
+                <w:highlight w:val="magenta"/>
                 <w:lang w:val="fr-FR"/>
               </w:rPr>
               <w:t xml:space="preserve"> avec un </w:t>
@@ -2323,6 +2326,7 @@
               <w:rPr>
                 <w:noProof/>
                 <w:color w:val="auto"/>
+                <w:highlight w:val="magenta"/>
                 <w:lang w:val="fr-FR"/>
               </w:rPr>
               <w:t>lien</w:t>
@@ -2331,6 +2335,7 @@
               <w:rPr>
                 <w:noProof/>
                 <w:color w:val="auto"/>
+                <w:highlight w:val="magenta"/>
                 <w:lang w:val="fr-FR"/>
               </w:rPr>
               <w:t xml:space="preserve"> </w:t>
@@ -2341,6 +2346,7 @@
                 <w:bCs/>
                 <w:noProof/>
                 <w:color w:val="auto"/>
+                <w:highlight w:val="magenta"/>
                 <w:lang w:val="fr-FR"/>
               </w:rPr>
               <w:t>X</w:t>
@@ -2349,6 +2355,7 @@
               <w:rPr>
                 <w:noProof/>
                 <w:color w:val="auto"/>
+                <w:highlight w:val="magenta"/>
                 <w:lang w:val="fr-FR"/>
               </w:rPr>
               <w:t xml:space="preserve"> pour supprimer </w:t>
@@ -2357,22 +2364,16 @@
               <w:rPr>
                 <w:noProof/>
                 <w:color w:val="auto"/>
-                <w:lang w:val="fr-FR"/>
-              </w:rPr>
-              <w:t>la relation à un article StoryTags/Delete</w:t>
-            </w:r>
-            <w:r>
-              <w:rPr>
-                <w:noProof/>
-                <w:color w:val="auto"/>
-                <w:lang w:val="fr-FR"/>
-              </w:rPr>
-              <w:t>.</w:t>
-            </w:r>
-            <w:r>
-              <w:rPr>
-                <w:noProof/>
-                <w:color w:val="auto"/>
+                <w:highlight w:val="magenta"/>
+                <w:lang w:val="fr-FR"/>
+              </w:rPr>
+              <w:t>la relation à un article StoryTags/Delete.</w:t>
+            </w:r>
+            <w:r>
+              <w:rPr>
+                <w:noProof/>
+                <w:color w:val="auto"/>
+                <w:highlight w:val="magenta"/>
                 <w:lang w:val="fr-FR"/>
               </w:rPr>
               <w:t xml:space="preserve"> (Dans le contenu du div avec la </w:t>
@@ -2381,6 +2382,7 @@
               <w:rPr>
                 <w:noProof/>
                 <w:color w:val="auto"/>
+                <w:highlight w:val="magenta"/>
                 <w:lang w:val="fr-CA"/>
               </w:rPr>
               <w:t>class="card-text"</w:t>
@@ -2389,6 +2391,7 @@
               <w:rPr>
                 <w:noProof/>
                 <w:color w:val="auto"/>
+                <w:highlight w:val="magenta"/>
                 <w:lang w:val="fr-FR"/>
               </w:rPr>
               <w:t>)</w:t>
@@ -2718,16 +2721,7 @@
                 <w:color w:val="auto"/>
                 <w:lang w:val="fr-FR"/>
               </w:rPr>
-              <w:t xml:space="preserve"> </w:t>
-            </w:r>
-            <w:r>
-              <w:rPr>
-                <w:rFonts w:cstheme="minorHAnsi"/>
-                <w:noProof/>
-                <w:color w:val="auto"/>
-                <w:lang w:val="fr-FR"/>
-              </w:rPr>
-              <w:t xml:space="preserve"> caractères</w:t>
+              <w:t xml:space="preserve">  caractères</w:t>
             </w:r>
             <w:r>
               <w:rPr>
@@ -7232,6 +7226,16 @@
 </file>
 
 <file path=customXml/item1.xml><?xml version="1.0" encoding="utf-8"?>
+<p:properties xmlns:p="http://schemas.microsoft.com/office/2006/metadata/properties" xmlns:xsi="http://www.w3.org/2001/XMLSchema-instance" xmlns:pc="http://schemas.microsoft.com/office/infopath/2007/PartnerControls">
+  <documentManagement/>
+</p:properties>
+</file>
+
+<file path=customXml/item2.xml><?xml version="1.0" encoding="utf-8"?>
+<b:Sources xmlns:b="http://schemas.openxmlformats.org/officeDocument/2006/bibliography" xmlns="http://schemas.openxmlformats.org/officeDocument/2006/bibliography" SelectedStyle="\APASixthEditionOfficeOnline.xsl" StyleName="APA" Version="6"/>
+</file>
+
+<file path=customXml/item3.xml><?xml version="1.0" encoding="utf-8"?>
 <ct:contentTypeSchema xmlns:ct="http://schemas.microsoft.com/office/2006/metadata/contentType" xmlns:ma="http://schemas.microsoft.com/office/2006/metadata/properties/metaAttributes" ct:_="" ma:_="" ma:contentTypeName="Document" ma:contentTypeID="0x010100354AEAE9FD62D747A26A546E5B1B5735" ma:contentTypeVersion="9" ma:contentTypeDescription="Crée un document." ma:contentTypeScope="" ma:versionID="45670149f0b2e242f3a8d428188cc564">
   <xsd:schema xmlns:xsd="http://www.w3.org/2001/XMLSchema" xmlns:xs="http://www.w3.org/2001/XMLSchema" xmlns:p="http://schemas.microsoft.com/office/2006/metadata/properties" xmlns:ns2="071933db-0376-4694-9786-b56cb37c4ec2" targetNamespace="http://schemas.microsoft.com/office/2006/metadata/properties" ma:root="true" ma:fieldsID="91ddbe44ea87bb26d8aecffc557f0fba" ns2:_="">
     <xsd:import namespace="071933db-0376-4694-9786-b56cb37c4ec2"/>
@@ -7409,16 +7413,6 @@
 </ct:contentTypeSchema>
 </file>
 
-<file path=customXml/item2.xml><?xml version="1.0" encoding="utf-8"?>
-<b:Sources xmlns:b="http://schemas.openxmlformats.org/officeDocument/2006/bibliography" xmlns="http://schemas.openxmlformats.org/officeDocument/2006/bibliography" SelectedStyle="\APASixthEditionOfficeOnline.xsl" StyleName="APA" Version="6"/>
-</file>
-
-<file path=customXml/item3.xml><?xml version="1.0" encoding="utf-8"?>
-<p:properties xmlns:p="http://schemas.microsoft.com/office/2006/metadata/properties" xmlns:xsi="http://www.w3.org/2001/XMLSchema-instance" xmlns:pc="http://schemas.microsoft.com/office/infopath/2007/PartnerControls">
-  <documentManagement/>
-</p:properties>
-</file>
-
 <file path=customXml/item4.xml><?xml version="1.0" encoding="utf-8"?>
 <?mso-contentType ?>
 <FormTemplates xmlns="http://schemas.microsoft.com/sharepoint/v3/contenttype/forms">
@@ -7429,6 +7423,23 @@
 </file>
 
 <file path=customXml/itemProps1.xml><?xml version="1.0" encoding="utf-8"?>
+<ds:datastoreItem xmlns:ds="http://schemas.openxmlformats.org/officeDocument/2006/customXml" ds:itemID="{FDBC88B7-C502-46FD-9B2D-62061649CD38}">
+  <ds:schemaRefs>
+    <ds:schemaRef ds:uri="http://schemas.microsoft.com/office/2006/metadata/properties"/>
+    <ds:schemaRef ds:uri="http://schemas.microsoft.com/office/infopath/2007/PartnerControls"/>
+  </ds:schemaRefs>
+</ds:datastoreItem>
+</file>
+
+<file path=customXml/itemProps2.xml><?xml version="1.0" encoding="utf-8"?>
+<ds:datastoreItem xmlns:ds="http://schemas.openxmlformats.org/officeDocument/2006/customXml" ds:itemID="{86D1C53D-3019-4C73-A2B3-82FC9063BE69}">
+  <ds:schemaRefs>
+    <ds:schemaRef ds:uri="http://schemas.openxmlformats.org/officeDocument/2006/bibliography"/>
+  </ds:schemaRefs>
+</ds:datastoreItem>
+</file>
+
+<file path=customXml/itemProps3.xml><?xml version="1.0" encoding="utf-8"?>
 <ds:datastoreItem xmlns:ds="http://schemas.openxmlformats.org/officeDocument/2006/customXml" ds:itemID="{F73817CE-6C24-4602-B65A-3DE68263A19D}">
   <ds:schemaRefs>
     <ds:schemaRef ds:uri="http://schemas.microsoft.com/office/2006/metadata/contentType"/>
@@ -7446,23 +7457,6 @@
 </ds:datastoreItem>
 </file>
 
-<file path=customXml/itemProps2.xml><?xml version="1.0" encoding="utf-8"?>
-<ds:datastoreItem xmlns:ds="http://schemas.openxmlformats.org/officeDocument/2006/customXml" ds:itemID="{86D1C53D-3019-4C73-A2B3-82FC9063BE69}">
-  <ds:schemaRefs>
-    <ds:schemaRef ds:uri="http://schemas.openxmlformats.org/officeDocument/2006/bibliography"/>
-  </ds:schemaRefs>
-</ds:datastoreItem>
-</file>
-
-<file path=customXml/itemProps3.xml><?xml version="1.0" encoding="utf-8"?>
-<ds:datastoreItem xmlns:ds="http://schemas.openxmlformats.org/officeDocument/2006/customXml" ds:itemID="{FDBC88B7-C502-46FD-9B2D-62061649CD38}">
-  <ds:schemaRefs>
-    <ds:schemaRef ds:uri="http://schemas.microsoft.com/office/2006/metadata/properties"/>
-    <ds:schemaRef ds:uri="http://schemas.microsoft.com/office/infopath/2007/PartnerControls"/>
-  </ds:schemaRefs>
-</ds:datastoreItem>
-</file>
-
 <file path=customXml/itemProps4.xml><?xml version="1.0" encoding="utf-8"?>
 <ds:datastoreItem xmlns:ds="http://schemas.openxmlformats.org/officeDocument/2006/customXml" ds:itemID="{859D30C0-E214-427F-990B-D6598D8CC357}">
   <ds:schemaRefs>

</xml_diff>